<commit_message>
feat(backend): implement Z-06 structured reference payloads and restore test fixtures
</commit_message>
<xml_diff>
--- a/tests/jutlp_sample_docx_test_pack/01_valid_identified.docx
+++ b/tests/jutlp_sample_docx_test_pack/01_valid_identified.docx
@@ -3,6 +3,9 @@
 <w:document xmlns:wpc="http://schemas.microsoft.com/office/word/2010/wordprocessingCanvas" xmlns:mo="http://schemas.microsoft.com/office/mac/office/2008/main" xmlns:mc="http://schemas.openxmlformats.org/markup-compatibility/2006" xmlns:mv="urn:schemas-microsoft-com:mac:vml" xmlns:o="urn:schemas-microsoft-com:office:office" xmlns:r="http://schemas.openxmlformats.org/officeDocument/2006/relationships" xmlns:m="http://schemas.openxmlformats.org/officeDocument/2006/math" xmlns:v="urn:schemas-microsoft-com:vml" xmlns:wp14="http://schemas.microsoft.com/office/word/2010/wordprocessingDrawing" xmlns:wp="http://schemas.openxmlformats.org/drawingml/2006/wordprocessingDrawing" xmlns:w10="urn:schemas-microsoft-com:office:word" xmlns:w="http://schemas.openxmlformats.org/wordprocessingml/2006/main" xmlns:w14="http://schemas.microsoft.com/office/word/2010/wordml" xmlns:wpg="http://schemas.microsoft.com/office/word/2010/wordprocessingGroup" xmlns:wpi="http://schemas.microsoft.com/office/word/2010/wordprocessingInk" xmlns:wne="http://schemas.microsoft.com/office/word/2006/wordml" xmlns:wps="http://schemas.microsoft.com/office/word/2010/wordprocessingShape" mc:Ignorable="w14 wp14">
   <w:body>
     <w:p>
+      <w:pPr>
+        <w:pStyle w:val="Title"/>
+      </w:pPr>
       <w:r>
         <w:t>An Article Title</w:t>
       </w:r>
@@ -27,7 +30,35 @@
     </w:p>
     <w:p>
       <w:r>
-        <w:t>Body text.</w:t>
+        <w:t>Body text mentioning Smith et al. (2020).</w:t>
+      </w:r>
+    </w:p>
+    <w:p>
+      <w:pPr>
+        <w:pStyle w:val="Heading1"/>
+      </w:pPr>
+      <w:r>
+        <w:t>References</w:t>
+      </w:r>
+    </w:p>
+    <w:p>
+      <w:r>
+        <w:t>Smith, J. (2020). Sample paper title. Journal of Testing, 10(2), 100-110.</w:t>
+      </w:r>
+    </w:p>
+    <w:p>
+      <w:r>
+        <w:t>Jones, A., &amp; Taylor, B. (2021). Another study. Academic Publishing, 5(1), 45-50.</w:t>
+      </w:r>
+    </w:p>
+    <w:p>
+      <w:r>
+        <w:t>Brown, C. (2022). Digital reference checking. Software Engineering, 18(3), 200-215.</w:t>
+      </w:r>
+    </w:p>
+    <w:p>
+      <w:r>
+        <w:t>Wilson, D. (2023). Automated test pack validation. Testing Quarterly, 12(4), 300-310.</w:t>
       </w:r>
     </w:p>
     <w:sectPr>

</xml_diff>

<commit_message>
test: rewrite docx test pack and replace duplicated fixtures
</commit_message>
<xml_diff>
--- a/tests/jutlp_sample_docx_test_pack/01_valid_identified.docx
+++ b/tests/jutlp_sample_docx_test_pack/01_valid_identified.docx
@@ -3,8 +3,27 @@
 <w:document xmlns:wpc="http://schemas.microsoft.com/office/word/2010/wordprocessingCanvas" xmlns:mo="http://schemas.microsoft.com/office/mac/office/2008/main" xmlns:mc="http://schemas.openxmlformats.org/markup-compatibility/2006" xmlns:mv="urn:schemas-microsoft-com:mac:vml" xmlns:o="urn:schemas-microsoft-com:office:office" xmlns:r="http://schemas.openxmlformats.org/officeDocument/2006/relationships" xmlns:m="http://schemas.openxmlformats.org/officeDocument/2006/math" xmlns:v="urn:schemas-microsoft-com:vml" xmlns:wp14="http://schemas.microsoft.com/office/word/2010/wordprocessingDrawing" xmlns:wp="http://schemas.openxmlformats.org/drawingml/2006/wordprocessingDrawing" xmlns:w10="urn:schemas-microsoft-com:office:word" xmlns:w="http://schemas.openxmlformats.org/wordprocessingml/2006/main" xmlns:w14="http://schemas.microsoft.com/office/word/2010/wordml" xmlns:wpg="http://schemas.microsoft.com/office/word/2010/wordprocessingGroup" xmlns:wpi="http://schemas.microsoft.com/office/word/2010/wordprocessingInk" xmlns:wne="http://schemas.microsoft.com/office/word/2006/wordml" xmlns:wps="http://schemas.microsoft.com/office/word/2010/wordprocessingShape" mc:Ignorable="w14 wp14">
   <w:body>
     <w:p>
+      <w:pPr>
+        <w:pStyle w:val="ArticleTitle"/>
+      </w:pPr>
       <w:r>
-        <w:t>An Article Title</w:t>
+        <w:t>Active Learning in Higher Education: A Classroom Study</w:t>
+      </w:r>
+    </w:p>
+    <w:p>
+      <w:pPr>
+        <w:pStyle w:val="Authors"/>
+      </w:pPr>
+      <w:r>
+        <w:t>Chen, J.</w:t>
+      </w:r>
+    </w:p>
+    <w:p>
+      <w:pPr>
+        <w:pStyle w:val="AuthorAffiliations"/>
+      </w:pPr>
+      <w:r>
+        <w:t>Department of Education, Example University</w:t>
       </w:r>
     </w:p>
     <w:p>
@@ -13,8 +32,66 @@
       </w:r>
     </w:p>
     <w:p>
+      <w:pPr>
+        <w:pStyle w:val="FrontPageText"/>
+      </w:pPr>
       <w:r>
-        <w:t>Abstract body.</w:t>
+        <w:t>This manuscript examines active learning in higher education classrooms. The study compares response systems, peer discussion, and structured formative feedback across undergraduate teaching sessions. It reports participation, perceived usefulness, and assessment outcomes. Results suggest that frequent low-stakes interactions are associated with stronger engagement and clearer academic gains. The paper discusses practical implications for curriculum design, theoretical implications for engagement research, and limitations including self-reported data and a modest sample. These findings indicate that embedding purposeful active learning tasks can support student success when tasks are aligned with learning outcomes and feedback cycles.</w:t>
+      </w:r>
+    </w:p>
+    <w:p>
+      <w:r>
+        <w:t>Practitioner Notes</w:t>
+      </w:r>
+    </w:p>
+    <w:p>
+      <w:pPr>
+        <w:pStyle w:val="PractitionerNotes"/>
+      </w:pPr>
+      <w:r>
+        <w:t>Practical note 1 for teaching staff.</w:t>
+      </w:r>
+    </w:p>
+    <w:p>
+      <w:pPr>
+        <w:pStyle w:val="PractitionerNotes"/>
+      </w:pPr>
+      <w:r>
+        <w:t>Practical note 2 for teaching staff.</w:t>
+      </w:r>
+    </w:p>
+    <w:p>
+      <w:pPr>
+        <w:pStyle w:val="PractitionerNotes"/>
+      </w:pPr>
+      <w:r>
+        <w:t>Practical note 3 for teaching staff.</w:t>
+      </w:r>
+    </w:p>
+    <w:p>
+      <w:pPr>
+        <w:pStyle w:val="PractitionerNotes"/>
+      </w:pPr>
+      <w:r>
+        <w:t>Practical note 4 for teaching staff.</w:t>
+      </w:r>
+    </w:p>
+    <w:p>
+      <w:pPr>
+        <w:pStyle w:val="PractitionerNotes"/>
+      </w:pPr>
+      <w:r>
+        <w:t>Practical note 5 for teaching staff.</w:t>
+      </w:r>
+    </w:p>
+    <w:p>
+      <w:r>
+        <w:t>Keywords</w:t>
+      </w:r>
+    </w:p>
+    <w:p>
+      <w:r>
+        <w:t>higher education, active learning, student engagement, formative feedback</w:t>
       </w:r>
     </w:p>
     <w:p>
@@ -27,7 +104,219 @@
     </w:p>
     <w:p>
       <w:r>
-        <w:t>Body text.</w:t>
+        <w:t>Active learning has been linked to improved outcomes in higher education (Freeman et al., 2014; Chi, 2009). Engagement matters for persistence and achievement (Kahn, 2013; Snijders et al., 2020).</w:t>
+      </w:r>
+    </w:p>
+    <w:p>
+      <w:pPr>
+        <w:pStyle w:val="Heading1"/>
+      </w:pPr>
+      <w:r>
+        <w:t>Literature</w:t>
+      </w:r>
+    </w:p>
+    <w:p>
+      <w:r>
+        <w:t>Prior work distinguishes active, constructive, and interactive learning.</w:t>
+      </w:r>
+    </w:p>
+    <w:p>
+      <w:pPr>
+        <w:pStyle w:val="Heading1"/>
+      </w:pPr>
+      <w:r>
+        <w:t>Method</w:t>
+      </w:r>
+    </w:p>
+    <w:p>
+      <w:pPr>
+        <w:pStyle w:val="Heading2"/>
+      </w:pPr>
+      <w:r>
+        <w:t>Research Design</w:t>
+      </w:r>
+    </w:p>
+    <w:p>
+      <w:r>
+        <w:t>A within-course comparison design guided the study.</w:t>
+      </w:r>
+    </w:p>
+    <w:p>
+      <w:pPr>
+        <w:pStyle w:val="Heading2"/>
+      </w:pPr>
+      <w:r>
+        <w:t>Participants</w:t>
+      </w:r>
+    </w:p>
+    <w:p>
+      <w:r>
+        <w:t>Participants were undergraduate students at a public university.</w:t>
+      </w:r>
+    </w:p>
+    <w:p>
+      <w:pPr>
+        <w:pStyle w:val="Heading2"/>
+      </w:pPr>
+      <w:r>
+        <w:t>Measures</w:t>
+      </w:r>
+    </w:p>
+    <w:p>
+      <w:r>
+        <w:t>Measures included attendance, quiz scores, and engagement surveys.</w:t>
+      </w:r>
+    </w:p>
+    <w:p>
+      <w:pPr>
+        <w:pStyle w:val="Heading2"/>
+      </w:pPr>
+      <w:r>
+        <w:t>Procedure</w:t>
+      </w:r>
+    </w:p>
+    <w:p>
+      <w:r>
+        <w:t>Sessions were taught with active learning activities.</w:t>
+      </w:r>
+    </w:p>
+    <w:p>
+      <w:pPr>
+        <w:pStyle w:val="Heading2"/>
+      </w:pPr>
+      <w:r>
+        <w:t>Analysis</w:t>
+      </w:r>
+    </w:p>
+    <w:p>
+      <w:r>
+        <w:t>Data were analysed using descriptive statistics and thematic coding.</w:t>
+      </w:r>
+    </w:p>
+    <w:p>
+      <w:pPr>
+        <w:pStyle w:val="Heading1"/>
+      </w:pPr>
+      <w:r>
+        <w:t>Results</w:t>
+      </w:r>
+    </w:p>
+    <w:p>
+      <w:r>
+        <w:t>Participants reported greater engagement in interactive sessions.</w:t>
+      </w:r>
+    </w:p>
+    <w:p>
+      <w:pPr>
+        <w:pStyle w:val="Heading1"/>
+      </w:pPr>
+      <w:r>
+        <w:t>Discussion</w:t>
+      </w:r>
+    </w:p>
+    <w:p>
+      <w:pPr>
+        <w:pStyle w:val="Heading2"/>
+      </w:pPr>
+      <w:r>
+        <w:t>Practical Implications</w:t>
+      </w:r>
+    </w:p>
+    <w:p>
+      <w:r>
+        <w:t>Teachers should schedule interactive tasks deliberately.</w:t>
+      </w:r>
+    </w:p>
+    <w:p>
+      <w:pPr>
+        <w:pStyle w:val="Heading2"/>
+      </w:pPr>
+      <w:r>
+        <w:t>Theoretical Implications</w:t>
+      </w:r>
+    </w:p>
+    <w:p>
+      <w:r>
+        <w:t>The findings support active engagement models of learning.</w:t>
+      </w:r>
+    </w:p>
+    <w:p>
+      <w:pPr>
+        <w:pStyle w:val="Heading2"/>
+      </w:pPr>
+      <w:r>
+        <w:t>Limitations and Future Research</w:t>
+      </w:r>
+    </w:p>
+    <w:p>
+      <w:r>
+        <w:t>Future studies should include larger samples and objective assessment data.</w:t>
+      </w:r>
+    </w:p>
+    <w:p>
+      <w:pPr>
+        <w:pStyle w:val="Heading1"/>
+      </w:pPr>
+      <w:r>
+        <w:t>Conclusion</w:t>
+      </w:r>
+    </w:p>
+    <w:p>
+      <w:r>
+        <w:t>Active learning is worth modelling in practice.</w:t>
+      </w:r>
+    </w:p>
+    <w:p>
+      <w:pPr>
+        <w:pStyle w:val="Heading1"/>
+      </w:pPr>
+      <w:r>
+        <w:t>Acknowledgements</w:t>
+      </w:r>
+    </w:p>
+    <w:p>
+      <w:r>
+        <w:t>Thanks to peer reviewers and teaching teams.</w:t>
+      </w:r>
+    </w:p>
+    <w:p>
+      <w:pPr>
+        <w:pStyle w:val="Heading1"/>
+      </w:pPr>
+      <w:r>
+        <w:t>References</w:t>
+      </w:r>
+    </w:p>
+    <w:p>
+      <w:pPr>
+        <w:pStyle w:val="APA7ReferenceListEntry"/>
+      </w:pPr>
+      <w:r>
+        <w:t>Freeman, S., Eddy, S. L., McDonough, M., Smith, M. K., Okoroafor, N., Jordt, H., &amp; Wenderoth, M. P. (2014). Active learning increases student performance in science, engineering, and mathematics. Proceedings of the National Academy of Sciences, 111(23), 8410-8415. https://doi.org/10.1073/pnas.1319030111</w:t>
+      </w:r>
+    </w:p>
+    <w:p>
+      <w:pPr>
+        <w:pStyle w:val="APA7ReferenceListEntry"/>
+      </w:pPr>
+      <w:r>
+        <w:t>Chi, M. T. H. (2009). Active-constructive-interactive: A conceptual framework for differentiating learning activities. Topics in Cognitive Science, 1(1), 73-105. https://doi.org/10.1111/j.1756-8765.2008.01005.x</w:t>
+      </w:r>
+    </w:p>
+    <w:p>
+      <w:pPr>
+        <w:pStyle w:val="APA7ReferenceListEntry"/>
+      </w:pPr>
+      <w:r>
+        <w:t>Kahn, P. E. (2013). Theorising student engagement in higher education. British Educational Research Journal, 40(6), 1005-1018. https://doi.org/10.1002/berj.3121</w:t>
+      </w:r>
+    </w:p>
+    <w:p>
+      <w:pPr>
+        <w:pStyle w:val="APA7ReferenceListEntry"/>
+      </w:pPr>
+      <w:r>
+        <w:t>Snijders, I., Wijnia, L., Rikers, R. M. J. P., &amp; Loyens, S. M. M. (2020). Building bridges in higher education: Student-faculty relationship quality, student engagement, and student loyalty. International Journal of Educational Research, 100, 101538. https://doi.org/10.1016/j.ijer.2020.101538</w:t>
       </w:r>
     </w:p>
     <w:sectPr>
@@ -12085,6 +12374,24 @@
         <w:shd w:val="clear" w:color="auto" w:fill="FBCAA2" w:themeFill="accent6" w:themeFillTint="7F"/>
       </w:tcPr>
     </w:tblStylePr>
+  </w:style>
+  <w:style w:type="paragraph" w:customStyle="1" w:styleId="ArticleTitle">
+    <w:name w:val="Article Title"/>
+  </w:style>
+  <w:style w:type="paragraph" w:customStyle="1" w:styleId="Authors">
+    <w:name w:val="Authors"/>
+  </w:style>
+  <w:style w:type="paragraph" w:customStyle="1" w:styleId="AuthorAffiliations">
+    <w:name w:val="Author Affiliations"/>
+  </w:style>
+  <w:style w:type="paragraph" w:customStyle="1" w:styleId="FrontPageText">
+    <w:name w:val="Front Page Text"/>
+  </w:style>
+  <w:style w:type="paragraph" w:customStyle="1" w:styleId="PractitionerNotes">
+    <w:name w:val="Practitioner Notes"/>
+  </w:style>
+  <w:style w:type="paragraph" w:customStyle="1" w:styleId="APA7ReferenceListEntry">
+    <w:name w:val="APA 7 Reference List Entry"/>
   </w:style>
 </w:styles>
 </file>

</xml_diff>

<commit_message>
Complete Track B hardening, validator tests, and docx fixture updates
</commit_message>
<xml_diff>
--- a/tests/jutlp_sample_docx_test_pack/01_valid_identified.docx
+++ b/tests/jutlp_sample_docx_test_pack/01_valid_identified.docx
@@ -4,20 +4,100 @@
   <w:body>
     <w:p>
       <w:pPr>
-        <w:pStyle w:val="Title"/>
+        <w:pStyle w:val="ArticleTitle"/>
       </w:pPr>
       <w:r>
-        <w:t>An Article Title</w:t>
+        <w:t>A Comprehensive Study on Academic Formatting</w:t>
       </w:r>
     </w:p>
     <w:p>
+      <w:pPr>
+        <w:pStyle w:val="Authors"/>
+      </w:pPr>
+      <w:r>
+        <w:t>Jane Doe, John Smith</w:t>
+      </w:r>
+    </w:p>
+    <w:p>
+      <w:pPr>
+        <w:pStyle w:val="AuthorAffiliations"/>
+      </w:pPr>
+      <w:r>
+        <w:t>Department of Education, University of Research</w:t>
+      </w:r>
+    </w:p>
+    <w:p>
+      <w:pPr>
+        <w:pStyle w:val="Heading1"/>
+      </w:pPr>
       <w:r>
         <w:t>Abstract</w:t>
       </w:r>
     </w:p>
     <w:p>
       <w:r>
-        <w:t>Abstract body.</w:t>
+        <w:t>This paper presents an in-depth analysis of document validation rules.</w:t>
+      </w:r>
+    </w:p>
+    <w:p>
+      <w:pPr>
+        <w:pStyle w:val="Heading1"/>
+      </w:pPr>
+      <w:r>
+        <w:t>Practitioner Notes</w:t>
+      </w:r>
+    </w:p>
+    <w:p>
+      <w:pPr>
+        <w:pStyle w:val="PractitionerNotes"/>
+      </w:pPr>
+      <w:r>
+        <w:t>• Key insight for practitioners note number 1.</w:t>
+      </w:r>
+    </w:p>
+    <w:p>
+      <w:pPr>
+        <w:pStyle w:val="PractitionerNotes"/>
+      </w:pPr>
+      <w:r>
+        <w:t>• Key insight for practitioners note number 2.</w:t>
+      </w:r>
+    </w:p>
+    <w:p>
+      <w:pPr>
+        <w:pStyle w:val="PractitionerNotes"/>
+      </w:pPr>
+      <w:r>
+        <w:t>• Key insight for practitioners note number 3.</w:t>
+      </w:r>
+    </w:p>
+    <w:p>
+      <w:pPr>
+        <w:pStyle w:val="PractitionerNotes"/>
+      </w:pPr>
+      <w:r>
+        <w:t>• Key insight for practitioners note number 4.</w:t>
+      </w:r>
+    </w:p>
+    <w:p>
+      <w:pPr>
+        <w:pStyle w:val="PractitionerNotes"/>
+      </w:pPr>
+      <w:r>
+        <w:t>• Key insight for practitioners note number 5.</w:t>
+      </w:r>
+    </w:p>
+    <w:p>
+      <w:pPr>
+        <w:pStyle w:val="Heading1"/>
+      </w:pPr>
+      <w:r>
+        <w:t>Keywords</w:t>
+      </w:r>
+    </w:p>
+    <w:p>
+      <w:r>
+        <w:t>validation, jutlp, document structure, python, unit testing</w:t>
       </w:r>
     </w:p>
     <w:p>
@@ -30,7 +110,189 @@
     </w:p>
     <w:p>
       <w:r>
-        <w:t>Body text mentioning Smith et al. (2020).</w:t>
+        <w:t>This is the body text content for the Introduction section.</w:t>
+      </w:r>
+    </w:p>
+    <w:p>
+      <w:pPr>
+        <w:pStyle w:val="Heading1"/>
+      </w:pPr>
+      <w:r>
+        <w:t>Literature Review</w:t>
+      </w:r>
+    </w:p>
+    <w:p>
+      <w:r>
+        <w:t>This is the body text content for the Literature Review section.</w:t>
+      </w:r>
+    </w:p>
+    <w:p>
+      <w:pPr>
+        <w:pStyle w:val="Heading1"/>
+      </w:pPr>
+      <w:r>
+        <w:t>Methodology</w:t>
+      </w:r>
+    </w:p>
+    <w:p>
+      <w:r>
+        <w:t>This is the body text content for the Methodology section.</w:t>
+      </w:r>
+    </w:p>
+    <w:p>
+      <w:pPr>
+        <w:pStyle w:val="Heading2"/>
+      </w:pPr>
+      <w:r>
+        <w:t>Research Design</w:t>
+      </w:r>
+    </w:p>
+    <w:p>
+      <w:r>
+        <w:t>Detailed description of research design.</w:t>
+      </w:r>
+    </w:p>
+    <w:p>
+      <w:pPr>
+        <w:pStyle w:val="Heading2"/>
+      </w:pPr>
+      <w:r>
+        <w:t>Participants</w:t>
+      </w:r>
+    </w:p>
+    <w:p>
+      <w:r>
+        <w:t>Detailed description of participants involved in the study.</w:t>
+      </w:r>
+    </w:p>
+    <w:p>
+      <w:pPr>
+        <w:pStyle w:val="Heading2"/>
+      </w:pPr>
+      <w:r>
+        <w:t>Measures</w:t>
+      </w:r>
+    </w:p>
+    <w:p>
+      <w:r>
+        <w:t>Detailed description of instruments and materials used.</w:t>
+      </w:r>
+    </w:p>
+    <w:p>
+      <w:pPr>
+        <w:pStyle w:val="Heading2"/>
+      </w:pPr>
+      <w:r>
+        <w:t>Procedure</w:t>
+      </w:r>
+    </w:p>
+    <w:p>
+      <w:r>
+        <w:t>Step-by-step description of the procedure followed.</w:t>
+      </w:r>
+    </w:p>
+    <w:p>
+      <w:pPr>
+        <w:pStyle w:val="Heading2"/>
+      </w:pPr>
+      <w:r>
+        <w:t>Analysis</w:t>
+      </w:r>
+    </w:p>
+    <w:p>
+      <w:r>
+        <w:t>Explanation of the statistical methods used to analyze data.</w:t>
+      </w:r>
+    </w:p>
+    <w:p>
+      <w:pPr>
+        <w:pStyle w:val="Heading1"/>
+      </w:pPr>
+      <w:r>
+        <w:t>Results</w:t>
+      </w:r>
+    </w:p>
+    <w:p>
+      <w:r>
+        <w:t>This is the body text content for the Results section.</w:t>
+      </w:r>
+    </w:p>
+    <w:p>
+      <w:pPr>
+        <w:pStyle w:val="Heading1"/>
+      </w:pPr>
+      <w:r>
+        <w:t>Discussion</w:t>
+      </w:r>
+    </w:p>
+    <w:p>
+      <w:r>
+        <w:t>This is the body text content for the Discussion section.</w:t>
+      </w:r>
+    </w:p>
+    <w:p>
+      <w:pPr>
+        <w:pStyle w:val="Heading2"/>
+      </w:pPr>
+      <w:r>
+        <w:t>Practical Implications</w:t>
+      </w:r>
+    </w:p>
+    <w:p>
+      <w:r>
+        <w:t>Discussion of practical implications.</w:t>
+      </w:r>
+    </w:p>
+    <w:p>
+      <w:pPr>
+        <w:pStyle w:val="Heading2"/>
+      </w:pPr>
+      <w:r>
+        <w:t>Theoretical Implications</w:t>
+      </w:r>
+    </w:p>
+    <w:p>
+      <w:r>
+        <w:t>Discussion of theoretical implications.</w:t>
+      </w:r>
+    </w:p>
+    <w:p>
+      <w:pPr>
+        <w:pStyle w:val="Heading2"/>
+      </w:pPr>
+      <w:r>
+        <w:t>Limitations and Future Research</w:t>
+      </w:r>
+    </w:p>
+    <w:p>
+      <w:r>
+        <w:t>Overview of limitations and future research directions.</w:t>
+      </w:r>
+    </w:p>
+    <w:p>
+      <w:pPr>
+        <w:pStyle w:val="Heading1"/>
+      </w:pPr>
+      <w:r>
+        <w:t>Conclusion</w:t>
+      </w:r>
+    </w:p>
+    <w:p>
+      <w:r>
+        <w:t>This is the body text content for the Conclusion section.</w:t>
+      </w:r>
+    </w:p>
+    <w:p>
+      <w:pPr>
+        <w:pStyle w:val="Heading1"/>
+      </w:pPr>
+      <w:r>
+        <w:t>Acknowledgements</w:t>
+      </w:r>
+    </w:p>
+    <w:p>
+      <w:r>
+        <w:t>This is the body text content for the Acknowledgements section.</w:t>
       </w:r>
     </w:p>
     <w:p>
@@ -43,22 +305,7 @@
     </w:p>
     <w:p>
       <w:r>
-        <w:t>Smith, J. (2020). Sample paper title. Journal of Testing, 10(2), 100-110.</w:t>
-      </w:r>
-    </w:p>
-    <w:p>
-      <w:r>
-        <w:t>Jones, A., &amp; Taylor, B. (2021). Another study. Academic Publishing, 5(1), 45-50.</w:t>
-      </w:r>
-    </w:p>
-    <w:p>
-      <w:r>
-        <w:t>Brown, C. (2022). Digital reference checking. Software Engineering, 18(3), 200-215.</w:t>
-      </w:r>
-    </w:p>
-    <w:p>
-      <w:r>
-        <w:t>Wilson, D. (2023). Automated test pack validation. Testing Quarterly, 12(4), 300-310.</w:t>
+        <w:t>This is the body text content for the References section.</w:t>
       </w:r>
     </w:p>
     <w:sectPr>
@@ -12116,6 +12363,18 @@
         <w:shd w:val="clear" w:color="auto" w:fill="FBCAA2" w:themeFill="accent6" w:themeFillTint="7F"/>
       </w:tcPr>
     </w:tblStylePr>
+  </w:style>
+  <w:style w:type="paragraph" w:customStyle="1" w:styleId="ArticleTitle">
+    <w:name w:val="Article Title"/>
+  </w:style>
+  <w:style w:type="paragraph" w:customStyle="1" w:styleId="Authors">
+    <w:name w:val="Authors"/>
+  </w:style>
+  <w:style w:type="paragraph" w:customStyle="1" w:styleId="AuthorAffiliations">
+    <w:name w:val="Author Affiliations"/>
+  </w:style>
+  <w:style w:type="paragraph" w:customStyle="1" w:styleId="PractitionerNotes">
+    <w:name w:val="Practitioner Notes"/>
   </w:style>
 </w:styles>
 </file>

</xml_diff>